<commit_message>
Avanzada la memoria, empezada la presentación
</commit_message>
<xml_diff>
--- a/Practica 4/Memoria.docx
+++ b/Practica 4/Memoria.docx
@@ -3591,25 +3591,7 @@
         </w:rPr>
       </w:pPr>
       <w:r>
-        <w:t>Se</w:t>
-      </w:r>
-      <w:r>
-        <w:t xml:space="preserve"> implementa una función que </w:t>
-      </w:r>
-      <w:r>
-        <w:t>inicializa</w:t>
-      </w:r>
-      <w:r>
-        <w:t xml:space="preserve"> una matriz de pesos</w:t>
-      </w:r>
-      <w:r>
-        <w:t xml:space="preserve"> </w:t>
-      </w:r>
-      <w:r>
-        <w:t>con valores aleatorios en el rango</w:t>
-      </w:r>
-      <w:r>
-        <w:t xml:space="preserve"> [ - 0’12, 0’12].</w:t>
+        <w:t>Se implementa una función que inicializa una matriz de pesos con valores aleatorios en el rango [ - 0’12, 0’12].</w:t>
       </w:r>
     </w:p>
     <w:p>
@@ -4291,16 +4273,7 @@
     </w:p>
     <w:p>
       <w:r>
-        <w:t>P</w:t>
-      </w:r>
-      <w:r>
-        <w:t>ermite calcular el gradiente de</w:t>
-      </w:r>
-      <w:r>
-        <w:t xml:space="preserve">l </w:t>
-      </w:r>
-      <w:r>
-        <w:t>coste de la red neuronal.</w:t>
+        <w:t>Permite calcular el gradiente del coste de la red neuronal.</w:t>
       </w:r>
       <w:r>
         <w:t xml:space="preserve"> </w:t>
@@ -4308,28 +4281,7 @@
     </w:p>
     <w:p>
       <w:r>
-        <w:t>P</w:t>
-      </w:r>
-      <w:r>
-        <w:t xml:space="preserve">ara cada ejemplo de entrenamiento </w:t>
-      </w:r>
-      <w:r>
-        <w:t>primero se</w:t>
-      </w:r>
-      <w:r>
-        <w:t xml:space="preserve"> ejecuta una pasada hacia adelante</w:t>
-      </w:r>
-      <w:r>
-        <w:t xml:space="preserve">, que calcula </w:t>
-      </w:r>
-      <w:r>
-        <w:t>la salida de la red</w:t>
-      </w:r>
-      <w:r>
-        <w:t xml:space="preserve">. Y después </w:t>
-      </w:r>
-      <w:r>
-        <w:t>una pasada hacia atrás</w:t>
+        <w:t>Para cada ejemplo de entrenamiento primero se ejecuta una pasada hacia adelante, que calcula la salida de la red. Y después una pasada hacia atrás</w:t>
       </w:r>
       <w:r>
         <w:t>,</w:t>
@@ -5464,13 +5416,7 @@
         </w:drawing>
       </w:r>
       <w:r>
-        <w:t>U</w:t>
-      </w:r>
-      <w:r>
-        <w:t xml:space="preserve">na vez </w:t>
-      </w:r>
-      <w:r>
-        <w:t>se han procesado todos los ejemplos se calcula el gradiente</w:t>
+        <w:t>Una vez se han procesado todos los ejemplos se calcula el gradiente</w:t>
       </w:r>
       <w:r>
         <w:t xml:space="preserve">. Se lleva a cabo sin término de regularización. Se dividen los valores acumulados durante la </w:t>
@@ -8765,10 +8711,7 @@
         </w:rPr>
       </w:pPr>
       <w:r>
-        <w:t xml:space="preserve">Ahora se entrena la red neuronal y se obtienen los valores para las </w:t>
-      </w:r>
-      <w:r>
-        <w:t>Θ</w:t>
+        <w:t>Ahora se entrena la red neuronal y se obtienen los valores para las Θ</w:t>
       </w:r>
       <w:r>
         <w:t xml:space="preserve">. Para ello se utiliza </w:t>
@@ -10547,13 +10490,7 @@
     <w:p/>
     <w:p>
       <w:r>
-        <w:t xml:space="preserve">Ahora se prueba su efectividad con distintos valores para </w:t>
-      </w:r>
-      <w:r>
-        <w:t>λ</w:t>
-      </w:r>
-      <w:r>
-        <w:t xml:space="preserve"> y cantidad de iteraciones.</w:t>
+        <w:t>Ahora se prueba su efectividad con distintos valores para λ y cantidad de iteraciones.</w:t>
       </w:r>
       <w:r>
         <w:rPr>
@@ -14538,7 +14475,7 @@
 </file>
 
 <file path=customXml/itemProps2.xml><?xml version="1.0" encoding="utf-8"?>
-<ds:datastoreItem xmlns:ds="http://schemas.openxmlformats.org/officeDocument/2006/customXml" ds:itemID="{AF985789-4C1F-4A14-AE68-FB2C66827D70}">
+<ds:datastoreItem xmlns:ds="http://schemas.openxmlformats.org/officeDocument/2006/customXml" ds:itemID="{D9B19332-1BA1-48A8-8751-D6F41B3845D2}">
   <ds:schemaRefs>
     <ds:schemaRef ds:uri="http://schemas.openxmlformats.org/officeDocument/2006/bibliography"/>
   </ds:schemaRefs>

</xml_diff>